<commit_message>
spec: SPEC_0 2 con el arranque real del Maestro (ambar de fuera de servicio, D-40; rojo fijo de D-47); .docx de las SPEC y del 17 regenerados desde sus .md
Co-Authored-By: Claude Opus 5.5 (1M context) <noreply@anthropic.com>
</commit_message>
<xml_diff>
--- a/05_Funcional/17_Arquitectura_28-08_y_Decisiones_Abiertas.docx
+++ b/05_Funcional/17_Arquitectura_28-08_y_Decisiones_Abiertas.docx
@@ -65,21 +65,21 @@
           <w:b w:val="0"/>
           <w:sz w:val="21"/>
         </w:rPr>
-        <w:t xml:space="preserve"> Gana a </w:t>
-      </w:r>
-      <w:r>
-        <w:rPr>
-          <w:rFonts w:ascii="Consolas" w:hAnsi="Consolas"/>
-          <w:sz w:val="21"/>
-        </w:rPr>
-        <w:t>DECISIONES.md</w:t>
-      </w:r>
-      <w:r>
-        <w:rPr>
-          <w:b w:val="0"/>
-          <w:sz w:val="21"/>
-        </w:rPr>
-        <w:t xml:space="preserve"> y a </w:t>
+        <w:t xml:space="preserve"> Manda en todo lo que sea </w:t>
+      </w:r>
+      <w:r>
+        <w:rPr>
+          <w:b/>
+          <w:sz w:val="21"/>
+        </w:rPr>
+        <w:t>hardware medido</w:t>
+      </w:r>
+      <w:r>
+        <w:rPr>
+          <w:b w:val="0"/>
+          <w:sz w:val="21"/>
+        </w:rPr>
+        <w:t xml:space="preserve"> (</w:t>
       </w:r>
       <w:r>
         <w:rPr>
@@ -93,7 +93,7 @@
           <w:b w:val="0"/>
           <w:sz w:val="21"/>
         </w:rPr>
-        <w:t xml:space="preserve"> en todo lo que sea **hardware</w:t>
+        <w:t xml:space="preserve"> §12, §15) — y **en nada</w:t>
       </w:r>
     </w:p>
     <w:p>
@@ -105,21 +105,21 @@
           <w:b w:val="0"/>
           <w:sz w:val="21"/>
         </w:rPr>
-        <w:t>medido</w:t>
-      </w:r>
-      <w:r>
-        <w:rPr>
-          <w:b/>
-          <w:sz w:val="21"/>
-        </w:rPr>
-        <w:t xml:space="preserve"> (`CLAUDE.md` §12) — y </w:t>
-      </w:r>
-      <w:r>
-        <w:rPr>
-          <w:b w:val="0"/>
-          <w:sz w:val="21"/>
-        </w:rPr>
-        <w:t xml:space="preserve">no gana en nada mas**: lo decidido lo fija </w:t>
+        <w:t xml:space="preserve">mas**: lo demas lo fijan </w:t>
+      </w:r>
+      <w:r>
+        <w:rPr>
+          <w:rFonts w:ascii="Consolas" w:hAnsi="Consolas"/>
+          <w:sz w:val="21"/>
+        </w:rPr>
+        <w:t>SPEC_0..SPEC_8</w:t>
+      </w:r>
+      <w:r>
+        <w:rPr>
+          <w:b w:val="0"/>
+          <w:sz w:val="21"/>
+        </w:rPr>
+        <w:t xml:space="preserve">, y </w:t>
       </w:r>
       <w:r>
         <w:rPr>
@@ -133,7 +133,7 @@
           <w:b w:val="0"/>
           <w:sz w:val="21"/>
         </w:rPr>
-        <w:t>.</w:t>
+        <w:t xml:space="preserve"> es su indice.</w:t>
       </w:r>
     </w:p>
     <w:p>
@@ -627,7 +627,7 @@
           <w:color w:val="960000"/>
           <w:sz w:val="20"/>
         </w:rPr>
-        <w:t>`J16` p5 y p8 estan VACIOS y el firmware SIGUE leyendo sus flancos</w:t>
+        <w:t>`J16` p5 y p8 estan VACIOS</w:t>
       </w:r>
       <w:r>
         <w:rPr>
@@ -667,7 +667,39 @@
           <w:color w:val="960000"/>
           <w:sz w:val="20"/>
         </w:rPr>
-        <w:t xml:space="preserve">): lo que se cierre ahi contra los 3,3 V del borne contiguo </w:t>
+        <w:t xml:space="preserve">); desde </w:t>
+      </w:r>
+      <w:r>
+        <w:rPr>
+          <w:rFonts w:ascii="Consolas" w:hAnsi="Consolas"/>
+          <w:color w:val="960000"/>
+          <w:sz w:val="20"/>
+        </w:rPr>
+        <w:t>D-44</w:t>
+      </w:r>
+      <w:r>
+        <w:rPr>
+          <w:b w:val="0"/>
+          <w:color w:val="960000"/>
+          <w:sz w:val="20"/>
+        </w:rPr>
+        <w:t xml:space="preserve"> (</w:t>
+      </w:r>
+      <w:r>
+        <w:rPr>
+          <w:rFonts w:ascii="Consolas" w:hAnsi="Consolas"/>
+          <w:color w:val="960000"/>
+          <w:sz w:val="20"/>
+        </w:rPr>
+        <w:t>f9cad1f</w:t>
+      </w:r>
+      <w:r>
+        <w:rPr>
+          <w:b w:val="0"/>
+          <w:color w:val="960000"/>
+          <w:sz w:val="20"/>
+        </w:rPr>
+        <w:t xml:space="preserve">) el firmware ya no los lee, pero uno anterior al 14/09 </w:t>
       </w:r>
       <w:r>
         <w:rPr>
@@ -683,7 +715,7 @@
           <w:color w:val="960000"/>
           <w:sz w:val="20"/>
         </w:rPr>
-        <w:t xml:space="preserve">, y </w:t>
+        <w:t xml:space="preserve"> con un puente (</w:t>
       </w:r>
       <w:r>
         <w:rPr>
@@ -715,7 +747,7 @@
           <w:color w:val="960000"/>
           <w:sz w:val="20"/>
         </w:rPr>
-        <w:t xml:space="preserve">. </w:t>
+        <w:t xml:space="preserve">). En campo manda lo CARGADO. </w:t>
       </w:r>
       <w:r>
         <w:rPr>
@@ -10068,14 +10100,56 @@
                 <w:b w:val="0"/>
                 <w:sz w:val="19"/>
               </w:rPr>
-              <w:t xml:space="preserve">, que es lo correcto. Los pines siguen leidos activos en ALTO: </w:t>
+              <w:t xml:space="preserve">, que es lo correcto. ~~Los pines siguen leidos~~ → </w:t>
             </w:r>
             <w:r>
               <w:rPr>
                 <w:b/>
                 <w:sz w:val="19"/>
               </w:rPr>
-              <w:t>lo que entre por `J16` p5/p8 sigue componiendo secuencias</w:t>
+              <w:t>02/10 (`D-44`): sin lector</w:t>
+            </w:r>
+            <w:r>
+              <w:rPr>
+                <w:b w:val="0"/>
+                <w:sz w:val="19"/>
+              </w:rPr>
+              <w:t xml:space="preserve"> (</w:t>
+            </w:r>
+            <w:r>
+              <w:rPr>
+                <w:rFonts w:ascii="Consolas" w:hAnsi="Consolas"/>
+                <w:sz w:val="19"/>
+              </w:rPr>
+              <w:t>J16_P5_SIN_USO</w:t>
+            </w:r>
+            <w:r>
+              <w:rPr>
+                <w:b w:val="0"/>
+                <w:sz w:val="19"/>
+              </w:rPr>
+              <w:t>/</w:t>
+            </w:r>
+            <w:r>
+              <w:rPr>
+                <w:rFonts w:ascii="Consolas" w:hAnsi="Consolas"/>
+                <w:sz w:val="19"/>
+              </w:rPr>
+              <w:t>J16_P8_SIN_USO</w:t>
+            </w:r>
+            <w:r>
+              <w:rPr>
+                <w:b w:val="0"/>
+                <w:sz w:val="19"/>
+              </w:rPr>
+              <w:t xml:space="preserve">); con firmware anterior al 14/09, </w:t>
+            </w:r>
+            <w:r>
+              <w:rPr>
+                <w:b/>
+                <w:sz w:val="19"/>
+              </w:rPr>
+              <w:t>lo que entre por `J16` p5/p8 compone secuencias</w:t>
             </w:r>
           </w:p>
         </w:tc>
@@ -10452,15 +10526,15 @@
           <w:color w:val="960000"/>
           <w:sz w:val="20"/>
         </w:rPr>
-        <w:t xml:space="preserve"> de </w:t>
-      </w:r>
-      <w:r>
-        <w:rPr>
-          <w:b w:val="0"/>
-          <w:color w:val="960000"/>
-          <w:sz w:val="20"/>
-        </w:rPr>
-        <w:t xml:space="preserve">DECISIONES.md` esta decidiendo, y por eso alli figura como decision </w:t>
+        <w:t xml:space="preserve"> (cerrada; </w:t>
+      </w:r>
+      <w:r>
+        <w:rPr>
+          <w:b w:val="0"/>
+          <w:color w:val="960000"/>
+          <w:sz w:val="20"/>
+        </w:rPr>
+        <w:t xml:space="preserve">05_Funcional/historico/DECISIONES_hist.md`) decidia, y por eso alli figura como decision </w:t>
       </w:r>
       <w:r>
         <w:rPr>
@@ -11054,7 +11128,7 @@
                 <w:b w:val="0"/>
                 <w:sz w:val="19"/>
               </w:rPr>
-              <w:t xml:space="preserve"> ⚠️ </w:t>
+              <w:t xml:space="preserve"> ⚠️ ~~</w:t>
             </w:r>
             <w:r>
               <w:rPr>
@@ -11068,35 +11142,21 @@
                 <w:b w:val="0"/>
                 <w:sz w:val="19"/>
               </w:rPr>
-              <w:t xml:space="preserve"> —</w:t>
-            </w:r>
-            <w:r>
-              <w:rPr>
-                <w:rFonts w:ascii="Consolas" w:hAnsi="Consolas"/>
-                <w:sz w:val="19"/>
-              </w:rPr>
-              <w:t>BOTON1</w:t>
+              <w:t xml:space="preserve">~~ → </w:t>
+            </w:r>
+            <w:r>
+              <w:rPr>
+                <w:b/>
+                <w:sz w:val="19"/>
+              </w:rPr>
+              <w:t>02/10 (`D-44`): `J16_P5_SIN_USO`, sin lector</w:t>
             </w:r>
             <w:r>
               <w:rPr>
                 <w:b w:val="0"/>
                 <w:sz w:val="19"/>
               </w:rPr>
-              <w:t xml:space="preserve"> alimenta </w:t>
-            </w:r>
-            <w:r>
-              <w:rPr>
-                <w:rFonts w:ascii="Consolas" w:hAnsi="Consolas"/>
-                <w:sz w:val="19"/>
-              </w:rPr>
-              <w:t>botonArriba()</w:t>
-            </w:r>
-            <w:r>
-              <w:rPr>
-                <w:b w:val="0"/>
-                <w:sz w:val="19"/>
-              </w:rPr>
-              <w:t xml:space="preserve">, con llamadores vivos— o sea que </w:t>
+              <w:t xml:space="preserve">; con firmware anterior </w:t>
             </w:r>
             <w:r>
               <w:rPr>
@@ -11228,13 +11288,27 @@
                 <w:b/>
                 <w:sz w:val="19"/>
               </w:rPr>
-              <w:t>CADUCADO EL 05/09 (`D-1`): idem `p5` — LIBRE Y SIN CABLEAR, y el firmware sigue leyendolo</w:t>
+              <w:t>CADUCADO EL 05/09 (`D-1`): idem `p5` — LIBRE Y SIN CABLEAR</w:t>
             </w:r>
             <w:r>
               <w:rPr>
                 <w:b w:val="0"/>
                 <w:sz w:val="19"/>
               </w:rPr>
+              <w:t xml:space="preserve">; ~~el firmware sigue leyendolo~~ → </w:t>
+            </w:r>
+            <w:r>
+              <w:rPr>
+                <w:b/>
+                <w:sz w:val="19"/>
+              </w:rPr>
+              <w:t>sin lector desde `D-44`</w:t>
+            </w:r>
+            <w:r>
+              <w:rPr>
+                <w:b w:val="0"/>
+                <w:sz w:val="19"/>
+              </w:rPr>
               <w:t xml:space="preserve"> (</w:t>
             </w:r>
             <w:r>
@@ -11242,21 +11316,7 @@
                 <w:rFonts w:ascii="Consolas" w:hAnsi="Consolas"/>
                 <w:sz w:val="19"/>
               </w:rPr>
-              <w:t>BOTON2</w:t>
-            </w:r>
-            <w:r>
-              <w:rPr>
-                <w:b w:val="0"/>
-                <w:sz w:val="19"/>
-              </w:rPr>
-              <w:t xml:space="preserve"> → </w:t>
-            </w:r>
-            <w:r>
-              <w:rPr>
-                <w:rFonts w:ascii="Consolas" w:hAnsi="Consolas"/>
-                <w:sz w:val="19"/>
-              </w:rPr>
-              <w:t>botonAbajo()</w:t>
+              <w:t>J16_P8_SIN_USO</w:t>
             </w:r>
             <w:r>
               <w:rPr>
@@ -11783,15 +11843,15 @@
           <w:color w:val="960000"/>
           <w:sz w:val="20"/>
         </w:rPr>
-        <w:t xml:space="preserve"> De los cuatro getters de boton, </w:t>
-      </w:r>
-      <w:r>
-        <w:rPr>
-          <w:b/>
-          <w:color w:val="960000"/>
-          <w:sz w:val="20"/>
-        </w:rPr>
-        <w:t>dos estan muertos y dos NO</w:t>
+        <w:t xml:space="preserve"> ~~De los cuatro getters de boton, dos estan muertos y dos NO~~ → </w:t>
+      </w:r>
+      <w:r>
+        <w:rPr>
+          <w:b/>
+          <w:color w:val="960000"/>
+          <w:sz w:val="20"/>
+        </w:rPr>
+        <w:t>02/10: salieron los cuatro</w:t>
       </w:r>
       <w:r>
         <w:rPr>
@@ -12055,34 +12115,91 @@
           <w:color w:val="960000"/>
           <w:sz w:val="20"/>
         </w:rPr>
-        <w:t>, y ademas compone secuencias del mando (§2.4) | ``</w:t>
-      </w:r>
-      <w:r>
-        <w:rPr>
-          <w:rFonts w:ascii="Consolas" w:hAnsi="Consolas"/>
-          <w:color w:val="960000"/>
-          <w:sz w:val="20"/>
-        </w:rPr>
-        <w:t xml:space="preserve"> grep -n "bool botonAceptar\|bool botonCancelar\|bool botonArriba\|bool botonAbajo" Maestro/src/botones.cpp Esclavo/src/botones.cpp grep -rn "botonArriba\|botonAbajo" Maestro/src Esclavo/src grep -n "pinMode(BOTON[12], INPUT)\|b[12].pin = BOTON[12]" Maestro/src/botones.cpp Esclavo/src/botones.cpp </w:t>
-      </w:r>
-      <w:r>
-        <w:rPr>
-          <w:rFonts w:ascii="Consolas" w:hAnsi="Consolas"/>
-          <w:color w:val="960000"/>
-          <w:sz w:val="20"/>
-        </w:rPr>
-      </w:r>
-      <w:r>
-        <w:rPr>
-          <w:rFonts w:ascii="Consolas" w:hAnsi="Consolas"/>
-          <w:color w:val="960000"/>
-          <w:sz w:val="20"/>
-        </w:rPr>
-        <w:t xml:space="preserve"> **Por eso «los cuatro botones estan fuera» es media verdad y no se escribe asi en ningun sitio:** fuera esta el **pulsador** (el plastico), y fuera estan **Aceptar** y **Cancelar** (el codigo). **Arriba y Abajo siguen leyendo cobre**, y ese cobre esta a un milimetro y medio de los 12 V de </w:t>
-      </w:r>
-      <w:r>
-        <w:rPr>
-          <w:b w:val="0"/>
+        <w:t xml:space="preserve">, y ademas compone secuencias del mando (§2.4) | </w:t>
+      </w:r>
+      <w:r>
+        <w:rPr>
+          <w:b/>
+          <w:color w:val="960000"/>
+          <w:sz w:val="20"/>
+        </w:rPr>
+        <w:t>02/10 (`D-44`, `f9cad1f`): salieron las dos filas de arriba; `PB9`/`PB13` quedan como entrada sin lectura.</w:t>
+      </w:r>
+      <w:r>
+        <w:rPr>
+          <w:b w:val="0"/>
+          <w:color w:val="960000"/>
+          <w:sz w:val="20"/>
+        </w:rPr>
+        <w:t xml:space="preserve"> </w:t>
+      </w:r>
+      <w:r>
+        <w:rPr>
+          <w:rFonts w:ascii="Consolas" w:hAnsi="Consolas"/>
+          <w:color w:val="960000"/>
+          <w:sz w:val="20"/>
+        </w:rPr>
+        <w:t>grep -rn "J16_P5_SIN_USO\|J16_P8_SIN_USO" Maestro/src Esclavo/src</w:t>
+      </w:r>
+      <w:r>
+        <w:rPr>
+          <w:b w:val="0"/>
+          <w:color w:val="960000"/>
+          <w:sz w:val="20"/>
+        </w:rPr>
+        <w:t xml:space="preserve"> (solo el </w:t>
+      </w:r>
+      <w:r>
+        <w:rPr>
+          <w:rFonts w:ascii="Consolas" w:hAnsi="Consolas"/>
+          <w:color w:val="960000"/>
+          <w:sz w:val="20"/>
+        </w:rPr>
+        <w:t>pinMode</w:t>
+      </w:r>
+      <w:r>
+        <w:rPr>
+          <w:b w:val="0"/>
+          <w:color w:val="960000"/>
+          <w:sz w:val="20"/>
+        </w:rPr>
+        <w:t xml:space="preserve"> de </w:t>
+      </w:r>
+      <w:r>
+        <w:rPr>
+          <w:rFonts w:ascii="Consolas" w:hAnsi="Consolas"/>
+          <w:color w:val="960000"/>
+          <w:sz w:val="20"/>
+        </w:rPr>
+        <w:t>botones_setup()</w:t>
+      </w:r>
+      <w:r>
+        <w:rPr>
+          <w:b w:val="0"/>
+          <w:color w:val="960000"/>
+          <w:sz w:val="20"/>
+        </w:rPr>
+        <w:t>). ~~</w:t>
+      </w:r>
+      <w:r>
+        <w:rPr>
+          <w:b/>
+          <w:color w:val="960000"/>
+          <w:sz w:val="20"/>
+        </w:rPr>
+        <w:t>Arriba y Abajo siguen leyendo cobre</w:t>
+      </w:r>
+      <w:r>
+        <w:rPr>
+          <w:b w:val="0"/>
+          <w:color w:val="960000"/>
+          <w:sz w:val="20"/>
+        </w:rPr>
+        <w:t xml:space="preserve">~~ → ya no; pero ese cobre esta a un milimetro y medio de los 12 V de </w:t>
+      </w:r>
+      <w:r>
+        <w:rPr>
+          <w:rFonts w:ascii="Consolas" w:hAnsi="Consolas"/>
           <w:color w:val="960000"/>
           <w:sz w:val="20"/>
         </w:rPr>
@@ -12090,35 +12207,27 @@
       </w:r>
       <w:r>
         <w:rPr>
-          <w:rFonts w:ascii="Consolas" w:hAnsi="Consolas"/>
-          <w:color w:val="960000"/>
-          <w:sz w:val="20"/>
-        </w:rPr>
-        <w:t xml:space="preserve"> (§1.7 abajo). **</w:t>
-      </w:r>
-      <w:r>
-        <w:rPr>
-          <w:b w:val="0"/>
-          <w:color w:val="960000"/>
-          <w:sz w:val="20"/>
-        </w:rPr>
-        <w:t>p5</w:t>
-      </w:r>
-      <w:r>
-        <w:rPr>
-          <w:rFonts w:ascii="Consolas" w:hAnsi="Consolas"/>
-          <w:color w:val="960000"/>
-          <w:sz w:val="20"/>
-        </w:rPr>
-        <w:t xml:space="preserve"> y </w:t>
-      </w:r>
-      <w:r>
-        <w:rPr>
-          <w:b w:val="0"/>
-          <w:color w:val="960000"/>
-          <w:sz w:val="20"/>
-        </w:rPr>
-        <w:t>p8` se dejan sin cablear, y no se puentean «para probar»** fuera del paso 29 de la guia.</w:t>
+          <w:b w:val="0"/>
+          <w:color w:val="960000"/>
+          <w:sz w:val="20"/>
+        </w:rPr>
+        <w:t xml:space="preserve"> (§1.7 abajo) y en campo manda lo CARGADO. </w:t>
+      </w:r>
+      <w:r>
+        <w:rPr>
+          <w:b/>
+          <w:color w:val="960000"/>
+          <w:sz w:val="20"/>
+        </w:rPr>
+        <w:t>`p5` y `p8` se dejan sin cablear, y no se puentean «para probar»</w:t>
+      </w:r>
+      <w:r>
+        <w:rPr>
+          <w:b w:val="0"/>
+          <w:color w:val="960000"/>
+          <w:sz w:val="20"/>
+        </w:rPr>
+        <w:t xml:space="preserve"> fuera del paso 29 de la guia.</w:t>
       </w:r>
     </w:p>
     <w:p>
@@ -24323,7 +24432,7 @@
                 <w:rFonts w:ascii="Consolas" w:hAnsi="Consolas"/>
                 <w:sz w:val="19"/>
               </w:rPr>
-              <w:t>05_Funcional/10_Manual_Modulo_Bluetooth_Telemetria.md</w:t>
+              <w:t>05_Funcional/historico/10_Manual_Modulo_Bluetooth_Telemetria.md</w:t>
             </w:r>
             <w:r>
               <w:rPr>

</xml_diff>